<commit_message>
docs: update group 3 acceptance form
</commit_message>
<xml_diff>
--- a/管理表单/T-05_课程设计验收单_NekoCafe_第3组.docx
+++ b/管理表单/T-05_课程设计验收单_NekoCafe_第3组.docx
@@ -16,23 +16,7 @@
           <w:sz w:val="28"/>
           <w:lang w:eastAsia="zh-CN"/>
         </w:rPr>
-        <w:t>北京林业大学</w:t>
-      </w:r>
-      <w:r>
-        <w:rPr>
-          <w:color w:val="777777"/>
-          <w:sz w:val="28"/>
-          <w:lang w:eastAsia="zh-CN"/>
-        </w:rPr>
-        <w:t xml:space="preserve"> · </w:t>
-      </w:r>
-      <w:r>
-        <w:rPr>
-          <w:color w:val="777777"/>
-          <w:sz w:val="28"/>
-          <w:lang w:eastAsia="zh-CN"/>
-        </w:rPr>
-        <w:t>信息学院</w:t>
+        <w:t>北京林业大学 · 信息学院</w:t>
       </w:r>
     </w:p>
     <w:p>
@@ -50,43 +34,7 @@
           <w:sz w:val="32"/>
           <w:lang w:eastAsia="zh-CN"/>
         </w:rPr>
-        <w:t>《软件工程（课程设计）</w:t>
-      </w:r>
-      <w:r>
-        <w:rPr>
-          <w:b/>
-          <w:color w:val="1A7A3D"/>
-          <w:sz w:val="32"/>
-          <w:lang w:eastAsia="zh-CN"/>
-        </w:rPr>
-        <w:t xml:space="preserve">  </w:t>
-      </w:r>
-      <w:r>
-        <w:rPr>
-          <w:b/>
-          <w:color w:val="1A7A3D"/>
-          <w:sz w:val="32"/>
-          <w:lang w:eastAsia="zh-CN"/>
-        </w:rPr>
-        <w:t>管理表单</w:t>
-      </w:r>
-      <w:r>
-        <w:rPr>
-          <w:b/>
-          <w:color w:val="1A7A3D"/>
-          <w:sz w:val="32"/>
-          <w:lang w:eastAsia="zh-CN"/>
-        </w:rPr>
-        <w:t xml:space="preserve"> T-05</w:t>
-      </w:r>
-      <w:r>
-        <w:rPr>
-          <w:b/>
-          <w:color w:val="1A7A3D"/>
-          <w:sz w:val="32"/>
-          <w:lang w:eastAsia="zh-CN"/>
-        </w:rPr>
-        <w:t>》</w:t>
+        <w:t>《软件工程（课程设计）  管理表单 T-05》</w:t>
       </w:r>
     </w:p>
     <w:p>
@@ -94,7 +42,6 @@
         <w:spacing w:after="80"/>
         <w:jc w:val="center"/>
       </w:pPr>
-      <w:proofErr w:type="spellStart"/>
       <w:r>
         <w:rPr>
           <w:b/>
@@ -103,7 +50,6 @@
         </w:rPr>
         <w:t>课程设计验收单</w:t>
       </w:r>
-      <w:proofErr w:type="spellEnd"/>
     </w:p>
     <w:p>
       <w:pPr>
@@ -389,21 +335,7 @@
                 <w:b/>
                 <w:color w:val="1A7A3D"/>
               </w:rPr>
-              <w:t>小组</w:t>
-            </w:r>
-            <w:r>
-              <w:rPr>
-                <w:b/>
-                <w:color w:val="1A7A3D"/>
-              </w:rPr>
-              <w:t xml:space="preserve"> / </w:t>
-            </w:r>
-            <w:r>
-              <w:rPr>
-                <w:b/>
-                <w:color w:val="1A7A3D"/>
-              </w:rPr>
-              <w:t>组号</w:t>
+              <w:t>小组 / 组号</w:t>
             </w:r>
           </w:p>
         </w:tc>
@@ -424,16 +356,7 @@
               <w:spacing w:after="40"/>
             </w:pPr>
             <w:r>
-              <w:t>第</w:t>
-            </w:r>
-            <w:r>
-              <w:t>3</w:t>
-            </w:r>
-            <w:r>
-              <w:t>组</w:t>
-            </w:r>
-            <w:r>
-              <w:t xml:space="preserve"> / G03</w:t>
+              <w:t>第3组 / G03</w:t>
             </w:r>
           </w:p>
         </w:tc>
@@ -464,35 +387,7 @@
                 <w:b/>
                 <w:color w:val="1A7A3D"/>
               </w:rPr>
-              <w:t>班级</w:t>
-            </w:r>
-            <w:r>
-              <w:rPr>
-                <w:b/>
-                <w:color w:val="1A7A3D"/>
-              </w:rPr>
-              <w:t xml:space="preserve"> / </w:t>
-            </w:r>
-            <w:r>
-              <w:rPr>
-                <w:b/>
-                <w:color w:val="1A7A3D"/>
-              </w:rPr>
-              <w:t>学号</w:t>
-            </w:r>
-            <w:r>
-              <w:rPr>
-                <w:b/>
-                <w:color w:val="1A7A3D"/>
-              </w:rPr>
-              <w:t xml:space="preserve"> / </w:t>
-            </w:r>
-            <w:r>
-              <w:rPr>
-                <w:b/>
-                <w:color w:val="1A7A3D"/>
-              </w:rPr>
-              <w:t>姓名</w:t>
+              <w:t>班级 / 学号 / 姓名</w:t>
             </w:r>
           </w:p>
         </w:tc>
@@ -684,31 +579,7 @@
                 <w:color w:val="1A7A3D"/>
                 <w:lang w:eastAsia="zh-CN"/>
               </w:rPr>
-              <w:t>📌</w:t>
-            </w:r>
-            <w:r>
-              <w:rPr>
-                <w:b/>
-                <w:color w:val="1A7A3D"/>
-                <w:lang w:eastAsia="zh-CN"/>
-              </w:rPr>
-              <w:t xml:space="preserve"> </w:t>
-            </w:r>
-            <w:r>
-              <w:rPr>
-                <w:b/>
-                <w:color w:val="1A7A3D"/>
-                <w:lang w:eastAsia="zh-CN"/>
-              </w:rPr>
-              <w:t>填写指引</w:t>
-            </w:r>
-            <w:r>
-              <w:rPr>
-                <w:b/>
-                <w:color w:val="1A7A3D"/>
-                <w:lang w:eastAsia="zh-CN"/>
-              </w:rPr>
-              <w:t xml:space="preserve"> </w:t>
+              <w:t xml:space="preserve">📌 填写指引 </w:t>
             </w:r>
           </w:p>
           <w:p>
@@ -724,71 +595,7 @@
                 <w:sz w:val="20"/>
                 <w:lang w:eastAsia="zh-CN"/>
               </w:rPr>
-              <w:t>本模板按章节结构预设了每节的标题与填写提示。请在每个</w:t>
-            </w:r>
-            <w:r>
-              <w:rPr>
-                <w:color w:val="2B2B2B"/>
-                <w:sz w:val="20"/>
-                <w:lang w:eastAsia="zh-CN"/>
-              </w:rPr>
-              <w:t xml:space="preserve"> "</w:t>
-            </w:r>
-            <w:r>
-              <w:rPr>
-                <w:color w:val="2B2B2B"/>
-                <w:sz w:val="20"/>
-                <w:lang w:eastAsia="zh-CN"/>
-              </w:rPr>
-              <w:t>（请在此处填写</w:t>
-            </w:r>
-            <w:r>
-              <w:rPr>
-                <w:color w:val="2B2B2B"/>
-                <w:sz w:val="20"/>
-                <w:lang w:eastAsia="zh-CN"/>
-              </w:rPr>
-              <w:t>……</w:t>
-            </w:r>
-            <w:r>
-              <w:rPr>
-                <w:color w:val="2B2B2B"/>
-                <w:sz w:val="20"/>
-                <w:lang w:eastAsia="zh-CN"/>
-              </w:rPr>
-              <w:t>）</w:t>
-            </w:r>
-            <w:r>
-              <w:rPr>
-                <w:color w:val="2B2B2B"/>
-                <w:sz w:val="20"/>
-                <w:lang w:eastAsia="zh-CN"/>
-              </w:rPr>
-              <w:t xml:space="preserve">" </w:t>
-            </w:r>
-            <w:r>
-              <w:rPr>
-                <w:color w:val="2B2B2B"/>
-                <w:sz w:val="20"/>
-                <w:lang w:eastAsia="zh-CN"/>
-              </w:rPr>
-              <w:t>区域中替换为正式内容；不允许删除章节标题；如某节确实不适用，请保留标题并标注「</w:t>
-            </w:r>
-            <w:r>
-              <w:rPr>
-                <w:color w:val="2B2B2B"/>
-                <w:sz w:val="20"/>
-                <w:lang w:eastAsia="zh-CN"/>
-              </w:rPr>
-              <w:t xml:space="preserve">N/A </w:t>
-            </w:r>
-            <w:r>
-              <w:rPr>
-                <w:color w:val="2B2B2B"/>
-                <w:sz w:val="20"/>
-                <w:lang w:eastAsia="zh-CN"/>
-              </w:rPr>
-              <w:t>及理由」。</w:t>
+              <w:t>本模板按章节结构预设了每节的标题与填写提示。请在每个 "（请在此处填写……）" 区域中替换为正式内容；不允许删除章节标题；如某节确实不适用，请保留标题并标注「N/A 及理由」。</w:t>
             </w:r>
           </w:p>
         </w:tc>
@@ -809,26 +616,14 @@
         </w:pBdr>
         <w:spacing w:before="280" w:after="120"/>
       </w:pPr>
-      <w:proofErr w:type="gramStart"/>
       <w:r>
         <w:rPr>
           <w:b/>
           <w:color w:val="1A7A3D"/>
           <w:sz w:val="36"/>
         </w:rPr>
-        <w:t xml:space="preserve">1  </w:t>
+        <w:t>1  小组信息</w:t>
       </w:r>
-      <w:proofErr w:type="spellStart"/>
-      <w:r>
-        <w:rPr>
-          <w:b/>
-          <w:color w:val="1A7A3D"/>
-          <w:sz w:val="36"/>
-        </w:rPr>
-        <w:t>小组信息</w:t>
-      </w:r>
-      <w:proofErr w:type="spellEnd"/>
-      <w:proofErr w:type="gramEnd"/>
     </w:p>
     <w:tbl>
       <w:tblPr>
@@ -925,21 +720,7 @@
                 <w:color w:val="2B2B2B"/>
                 <w:sz w:val="19"/>
               </w:rPr>
-              <w:t>班级</w:t>
-            </w:r>
-            <w:r>
-              <w:rPr>
-                <w:color w:val="2B2B2B"/>
-                <w:sz w:val="19"/>
-              </w:rPr>
-              <w:t xml:space="preserve"> / </w:t>
-            </w:r>
-            <w:r>
-              <w:rPr>
-                <w:color w:val="2B2B2B"/>
-                <w:sz w:val="19"/>
-              </w:rPr>
-              <w:t>组号</w:t>
+              <w:t>班级 / 组号</w:t>
             </w:r>
           </w:p>
         </w:tc>
@@ -1044,7 +825,6 @@
               <w:spacing w:before="40" w:after="40"/>
               <w:jc w:val="center"/>
             </w:pPr>
-            <w:proofErr w:type="spellStart"/>
             <w:r>
               <w:rPr>
                 <w:color w:val="2B2B2B"/>
@@ -1052,7 +832,6 @@
               </w:rPr>
               <w:t>项目名称</w:t>
             </w:r>
-            <w:proofErr w:type="spellEnd"/>
           </w:p>
         </w:tc>
         <w:tc>
@@ -1074,25 +853,11 @@
                 <w:lang w:eastAsia="zh-CN"/>
               </w:rPr>
             </w:pPr>
-            <w:proofErr w:type="spellStart"/>
             <w:r>
               <w:rPr>
                 <w:lang w:eastAsia="zh-CN"/>
               </w:rPr>
-              <w:t>NekoCafé</w:t>
-            </w:r>
-            <w:proofErr w:type="spellEnd"/>
-            <w:r>
-              <w:rPr>
-                <w:lang w:eastAsia="zh-CN"/>
-              </w:rPr>
-              <w:t xml:space="preserve"> </w:t>
-            </w:r>
-            <w:r>
-              <w:rPr>
-                <w:lang w:eastAsia="zh-CN"/>
-              </w:rPr>
-              <w:t>智慧餐饮预约平台</w:t>
+              <w:t>NekoCafé 智慧餐饮预约平台</w:t>
             </w:r>
           </w:p>
         </w:tc>
@@ -1118,7 +883,6 @@
               <w:spacing w:before="40" w:after="40"/>
               <w:jc w:val="center"/>
             </w:pPr>
-            <w:proofErr w:type="spellStart"/>
             <w:r>
               <w:rPr>
                 <w:color w:val="2B2B2B"/>
@@ -1126,7 +890,6 @@
               </w:rPr>
               <w:t>指导教师</w:t>
             </w:r>
-            <w:proofErr w:type="spellEnd"/>
           </w:p>
         </w:tc>
         <w:tc>
@@ -1244,33 +1007,7 @@
               <w:rPr>
                 <w:lang w:eastAsia="zh-CN"/>
               </w:rPr>
-              <w:t>本组提交的课程设计项目为</w:t>
-            </w:r>
-            <w:r>
-              <w:rPr>
-                <w:lang w:eastAsia="zh-CN"/>
-              </w:rPr>
-              <w:t xml:space="preserve"> </w:t>
-            </w:r>
-            <w:proofErr w:type="spellStart"/>
-            <w:r>
-              <w:rPr>
-                <w:lang w:eastAsia="zh-CN"/>
-              </w:rPr>
-              <w:t>NekoCafé</w:t>
-            </w:r>
-            <w:proofErr w:type="spellEnd"/>
-            <w:r>
-              <w:rPr>
-                <w:lang w:eastAsia="zh-CN"/>
-              </w:rPr>
-              <w:t xml:space="preserve"> </w:t>
-            </w:r>
-            <w:r>
-              <w:rPr>
-                <w:lang w:eastAsia="zh-CN"/>
-              </w:rPr>
-              <w:t>智慧餐饮预约平台，已完成前后端源码、数据库迁移、运行说明、演示账号、主要角色功能和相关课程设计文档。真实班级、指导教师和答辩日期可在最终提交前替换。</w:t>
+              <w:t>本组提交的课程设计项目为 NekoCafé 智慧餐饮预约平台，已完成前后端源码、数据库迁移、运行说明、演示账号、主要角色功能和相关课程设计文档。</w:t>
             </w:r>
           </w:p>
         </w:tc>
@@ -1301,16 +1038,7 @@
           <w:sz w:val="36"/>
           <w:lang w:eastAsia="zh-CN"/>
         </w:rPr>
-        <w:t xml:space="preserve">2  </w:t>
-      </w:r>
-      <w:r>
-        <w:rPr>
-          <w:b/>
-          <w:color w:val="1A7A3D"/>
-          <w:sz w:val="36"/>
-          <w:lang w:eastAsia="zh-CN"/>
-        </w:rPr>
-        <w:t>交付物核对清单（教师勾选）</w:t>
+        <w:t>2  交付物核对清单（教师勾选）</w:t>
       </w:r>
     </w:p>
     <w:tbl>
@@ -1347,7 +1075,6 @@
               <w:spacing w:before="40" w:after="40"/>
               <w:jc w:val="center"/>
             </w:pPr>
-            <w:proofErr w:type="spellStart"/>
             <w:r>
               <w:rPr>
                 <w:b/>
@@ -1356,7 +1083,6 @@
               </w:rPr>
               <w:t>编号</w:t>
             </w:r>
-            <w:proofErr w:type="spellEnd"/>
           </w:p>
         </w:tc>
         <w:tc>
@@ -1621,7 +1347,6 @@
                 <w:color w:val="2B2B2B"/>
                 <w:sz w:val="19"/>
               </w:rPr>
-              <w:lastRenderedPageBreak/>
               <w:t>D-02</w:t>
             </w:r>
           </w:p>
@@ -1651,15 +1376,7 @@
                 <w:sz w:val="19"/>
                 <w:lang w:eastAsia="zh-CN"/>
               </w:rPr>
-              <w:t>需求规格说明书</w:t>
-            </w:r>
-            <w:r>
-              <w:rPr>
-                <w:color w:val="2B2B2B"/>
-                <w:sz w:val="19"/>
-                <w:lang w:eastAsia="zh-CN"/>
-              </w:rPr>
-              <w:t xml:space="preserve"> SRS</w:t>
+              <w:t>需求规格说明书 SRS</w:t>
             </w:r>
           </w:p>
         </w:tc>
@@ -1761,6 +1478,7 @@
                 <w:color w:val="2B2B2B"/>
                 <w:sz w:val="19"/>
               </w:rPr>
+              <w:lastRenderedPageBreak/>
               <w:t>D-03</w:t>
             </w:r>
           </w:p>
@@ -2110,7 +1828,6 @@
             <w:pPr>
               <w:spacing w:before="40" w:after="40"/>
               <w:rPr>
-                <w:rFonts w:hint="eastAsia"/>
                 <w:lang w:eastAsia="zh-CN"/>
               </w:rPr>
             </w:pPr>
@@ -2680,14 +2397,7 @@
                 <w:color w:val="2B2B2B"/>
                 <w:sz w:val="19"/>
               </w:rPr>
-              <w:t>答辩</w:t>
-            </w:r>
-            <w:r>
-              <w:rPr>
-                <w:color w:val="2B2B2B"/>
-                <w:sz w:val="19"/>
-              </w:rPr>
-              <w:t xml:space="preserve"> PPT</w:t>
+              <w:t>答辩 PPT</w:t>
             </w:r>
           </w:p>
         </w:tc>
@@ -2757,7 +2467,6 @@
             <w:pPr>
               <w:spacing w:before="40" w:after="40"/>
               <w:rPr>
-                <w:rFonts w:hint="eastAsia"/>
                 <w:lang w:eastAsia="zh-CN"/>
               </w:rPr>
             </w:pPr>
@@ -2946,23 +2655,7 @@
                 <w:sz w:val="19"/>
                 <w:lang w:eastAsia="zh-CN"/>
               </w:rPr>
-              <w:t>项目源代码仓库（含</w:t>
-            </w:r>
-            <w:r>
-              <w:rPr>
-                <w:color w:val="2B2B2B"/>
-                <w:sz w:val="19"/>
-                <w:lang w:eastAsia="zh-CN"/>
-              </w:rPr>
-              <w:t xml:space="preserve"> README</w:t>
-            </w:r>
-            <w:r>
-              <w:rPr>
-                <w:color w:val="2B2B2B"/>
-                <w:sz w:val="19"/>
-                <w:lang w:eastAsia="zh-CN"/>
-              </w:rPr>
-              <w:t>）</w:t>
+              <w:t>项目源代码仓库（含 README）</w:t>
             </w:r>
           </w:p>
         </w:tc>
@@ -3286,7 +2979,6 @@
             <w:pPr>
               <w:spacing w:before="40" w:after="40"/>
               <w:rPr>
-                <w:rFonts w:hint="eastAsia"/>
                 <w:lang w:eastAsia="zh-CN"/>
               </w:rPr>
             </w:pPr>
@@ -3348,23 +3040,7 @@
                 <w:sz w:val="19"/>
                 <w:lang w:eastAsia="zh-CN"/>
               </w:rPr>
-              <w:t>周进度汇报表（</w:t>
-            </w:r>
-            <w:r>
-              <w:rPr>
-                <w:color w:val="2B2B2B"/>
-                <w:sz w:val="19"/>
-                <w:lang w:eastAsia="zh-CN"/>
-              </w:rPr>
-              <w:t xml:space="preserve">≥ 2 </w:t>
-            </w:r>
-            <w:r>
-              <w:rPr>
-                <w:color w:val="2B2B2B"/>
-                <w:sz w:val="19"/>
-                <w:lang w:eastAsia="zh-CN"/>
-              </w:rPr>
-              <w:t>份）</w:t>
+              <w:t>周进度汇报表（≥ 2 份）</w:t>
             </w:r>
           </w:p>
         </w:tc>
@@ -3495,18 +3171,8 @@
                 <w:sz w:val="19"/>
                 <w:lang w:eastAsia="zh-CN"/>
               </w:rPr>
-              <w:t>团队互评与个人</w:t>
+              <w:t>团队互评与个人贡献度表</w:t>
             </w:r>
-            <w:proofErr w:type="gramStart"/>
-            <w:r>
-              <w:rPr>
-                <w:color w:val="2B2B2B"/>
-                <w:sz w:val="19"/>
-                <w:lang w:eastAsia="zh-CN"/>
-              </w:rPr>
-              <w:t>贡献度表</w:t>
-            </w:r>
-            <w:proofErr w:type="gramEnd"/>
           </w:p>
         </w:tc>
         <w:tc>
@@ -3575,7 +3241,6 @@
             <w:pPr>
               <w:spacing w:before="40" w:after="40"/>
               <w:rPr>
-                <w:rFonts w:hint="eastAsia"/>
                 <w:lang w:eastAsia="zh-CN"/>
               </w:rPr>
             </w:pPr>
@@ -3625,19 +3290,7 @@
               <w:rPr>
                 <w:lang w:eastAsia="zh-CN"/>
               </w:rPr>
-              <w:t>交付物包括项目开题、需求、概要设计、详细设计、数据库设计、测试报告、用户手册、部署运维、总结报告、答辩材料、演示脚本</w:t>
-            </w:r>
-            <w:r>
-              <w:rPr>
-                <w:lang w:eastAsia="zh-CN"/>
-              </w:rPr>
-              <w:t>/</w:t>
-            </w:r>
-            <w:r>
-              <w:rPr>
-                <w:lang w:eastAsia="zh-CN"/>
-              </w:rPr>
-              <w:t>视频、源码仓库和管理表单。</w:t>
+              <w:t>交付物包括项目开题、需求、概要设计、详细设计、数据库设计、测试报告、用户手册、部署运维、总结报告、答辩材料、演示脚本/视频、源码仓库和管理表单。</w:t>
             </w:r>
           </w:p>
         </w:tc>
@@ -3658,26 +3311,14 @@
         </w:pBdr>
         <w:spacing w:before="280" w:after="120"/>
       </w:pPr>
-      <w:proofErr w:type="gramStart"/>
       <w:r>
         <w:rPr>
           <w:b/>
           <w:color w:val="1A7A3D"/>
           <w:sz w:val="36"/>
         </w:rPr>
-        <w:t xml:space="preserve">3  </w:t>
+        <w:t>3  演示与答辩评估</w:t>
       </w:r>
-      <w:proofErr w:type="spellStart"/>
-      <w:r>
-        <w:rPr>
-          <w:b/>
-          <w:color w:val="1A7A3D"/>
-          <w:sz w:val="36"/>
-        </w:rPr>
-        <w:t>演示与答辩评估</w:t>
-      </w:r>
-      <w:proofErr w:type="spellEnd"/>
-      <w:proofErr w:type="gramEnd"/>
     </w:p>
     <w:tbl>
       <w:tblPr>
@@ -3825,7 +3466,6 @@
               <w:spacing w:before="40" w:after="40"/>
               <w:jc w:val="center"/>
             </w:pPr>
-            <w:proofErr w:type="spellStart"/>
             <w:r>
               <w:rPr>
                 <w:color w:val="2B2B2B"/>
@@ -3833,7 +3473,6 @@
               </w:rPr>
               <w:t>现场演示</w:t>
             </w:r>
-            <w:proofErr w:type="spellEnd"/>
           </w:p>
         </w:tc>
         <w:tc>
@@ -3922,16 +3561,13 @@
               <w:spacing w:before="40" w:after="40"/>
               <w:jc w:val="center"/>
             </w:pPr>
-            <w:proofErr w:type="spellStart"/>
             <w:r>
               <w:rPr>
                 <w:color w:val="2B2B2B"/>
                 <w:sz w:val="19"/>
               </w:rPr>
-              <w:lastRenderedPageBreak/>
               <w:t>汇报清晰度</w:t>
             </w:r>
-            <w:proofErr w:type="spellEnd"/>
           </w:p>
         </w:tc>
         <w:tc>
@@ -4020,15 +3656,14 @@
               <w:spacing w:before="40" w:after="40"/>
               <w:jc w:val="center"/>
             </w:pPr>
-            <w:proofErr w:type="spellStart"/>
             <w:r>
               <w:rPr>
                 <w:color w:val="2B2B2B"/>
                 <w:sz w:val="19"/>
               </w:rPr>
+              <w:lastRenderedPageBreak/>
               <w:t>评委问询应答</w:t>
             </w:r>
-            <w:proofErr w:type="spellEnd"/>
           </w:p>
         </w:tc>
         <w:tc>
@@ -4117,7 +3752,6 @@
               <w:spacing w:before="40" w:after="40"/>
               <w:jc w:val="center"/>
             </w:pPr>
-            <w:proofErr w:type="spellStart"/>
             <w:r>
               <w:rPr>
                 <w:color w:val="2B2B2B"/>
@@ -4125,7 +3759,6 @@
               </w:rPr>
               <w:t>团队协作表现</w:t>
             </w:r>
-            <w:proofErr w:type="spellEnd"/>
           </w:p>
         </w:tc>
         <w:tc>
@@ -4214,7 +3847,6 @@
               <w:spacing w:before="40" w:after="40"/>
               <w:jc w:val="center"/>
             </w:pPr>
-            <w:proofErr w:type="spellStart"/>
             <w:r>
               <w:rPr>
                 <w:color w:val="2B2B2B"/>
@@ -4222,7 +3854,6 @@
               </w:rPr>
               <w:t>创新性与亮点</w:t>
             </w:r>
-            <w:proofErr w:type="spellEnd"/>
           </w:p>
         </w:tc>
         <w:tc>
@@ -4311,22 +3942,13 @@
               <w:spacing w:before="40" w:after="40"/>
               <w:jc w:val="center"/>
             </w:pPr>
-            <w:proofErr w:type="spellStart"/>
             <w:r>
               <w:rPr>
                 <w:color w:val="2B2B2B"/>
                 <w:sz w:val="19"/>
               </w:rPr>
-              <w:t>代</w:t>
+              <w:t>代码与文档诚信</w:t>
             </w:r>
-            <w:r>
-              <w:rPr>
-                <w:color w:val="2B2B2B"/>
-                <w:sz w:val="19"/>
-              </w:rPr>
-              <w:t>码与文档诚信</w:t>
-            </w:r>
-            <w:proofErr w:type="spellEnd"/>
           </w:p>
         </w:tc>
         <w:tc>
@@ -4415,21 +4037,12 @@
               <w:spacing w:before="40" w:after="40"/>
               <w:jc w:val="center"/>
             </w:pPr>
-            <w:proofErr w:type="spellStart"/>
             <w:r>
               <w:rPr>
                 <w:color w:val="2B2B2B"/>
                 <w:sz w:val="19"/>
               </w:rPr>
-              <w:t>总计</w:t>
-            </w:r>
-            <w:proofErr w:type="spellEnd"/>
-            <w:r>
-              <w:rPr>
-                <w:color w:val="2B2B2B"/>
-                <w:sz w:val="19"/>
-              </w:rPr>
-              <w:t xml:space="preserve"> / 100</w:t>
+              <w:t>总计 / 100</w:t>
             </w:r>
           </w:p>
         </w:tc>
@@ -4556,26 +4169,14 @@
         </w:pBdr>
         <w:spacing w:before="280" w:after="120"/>
       </w:pPr>
-      <w:proofErr w:type="gramStart"/>
       <w:r>
         <w:rPr>
           <w:b/>
           <w:color w:val="1A7A3D"/>
           <w:sz w:val="36"/>
         </w:rPr>
-        <w:t xml:space="preserve">4  </w:t>
+        <w:t>4  个人成绩汇总</w:t>
       </w:r>
-      <w:proofErr w:type="spellStart"/>
-      <w:r>
-        <w:rPr>
-          <w:b/>
-          <w:color w:val="1A7A3D"/>
-          <w:sz w:val="36"/>
-        </w:rPr>
-        <w:t>个人成绩汇总</w:t>
-      </w:r>
-      <w:proofErr w:type="spellEnd"/>
-      <w:proofErr w:type="gramEnd"/>
     </w:p>
     <w:tbl>
       <w:tblPr>
@@ -4776,7 +4377,6 @@
             <w:pPr>
               <w:spacing w:before="40" w:after="40"/>
               <w:rPr>
-                <w:rFonts w:hint="eastAsia"/>
                 <w:lang w:eastAsia="zh-CN"/>
               </w:rPr>
             </w:pPr>
@@ -4896,7 +4496,6 @@
             <w:pPr>
               <w:spacing w:before="40" w:after="40"/>
               <w:rPr>
-                <w:rFonts w:hint="eastAsia"/>
                 <w:lang w:eastAsia="zh-CN"/>
               </w:rPr>
             </w:pPr>
@@ -5016,7 +4615,6 @@
             <w:pPr>
               <w:spacing w:before="40" w:after="40"/>
               <w:rPr>
-                <w:rFonts w:hint="eastAsia"/>
                 <w:lang w:eastAsia="zh-CN"/>
               </w:rPr>
             </w:pPr>
@@ -5136,7 +4734,6 @@
             <w:pPr>
               <w:spacing w:before="40" w:after="40"/>
               <w:rPr>
-                <w:rFonts w:hint="eastAsia"/>
                 <w:lang w:eastAsia="zh-CN"/>
               </w:rPr>
             </w:pPr>
@@ -5256,7 +4853,6 @@
             <w:pPr>
               <w:spacing w:before="40" w:after="40"/>
               <w:rPr>
-                <w:rFonts w:hint="eastAsia"/>
                 <w:lang w:eastAsia="zh-CN"/>
               </w:rPr>
             </w:pPr>
@@ -5382,7 +4978,6 @@
         </w:pBdr>
         <w:spacing w:before="280" w:after="120"/>
       </w:pPr>
-      <w:proofErr w:type="gramStart"/>
       <w:r>
         <w:rPr>
           <w:b/>
@@ -5390,19 +4985,8 @@
           <w:sz w:val="36"/>
         </w:rPr>
         <w:lastRenderedPageBreak/>
-        <w:t xml:space="preserve">5  </w:t>
+        <w:t>5  总评意见</w:t>
       </w:r>
-      <w:proofErr w:type="spellStart"/>
-      <w:r>
-        <w:rPr>
-          <w:b/>
-          <w:color w:val="1A7A3D"/>
-          <w:sz w:val="36"/>
-        </w:rPr>
-        <w:t>总评意见</w:t>
-      </w:r>
-      <w:proofErr w:type="spellEnd"/>
-      <w:proofErr w:type="gramEnd"/>
     </w:p>
     <w:tbl>
       <w:tblPr>
@@ -5523,34 +5107,7 @@
               <w:t>☐</w:t>
             </w:r>
             <w:r>
-              <w:t>优</w:t>
-            </w:r>
-            <w:r>
-              <w:t xml:space="preserve"> (90+)    ☐ </w:t>
-            </w:r>
-            <w:r>
-              <w:t>良</w:t>
-            </w:r>
-            <w:r>
-              <w:t xml:space="preserve"> (80-89)    ☐ </w:t>
-            </w:r>
-            <w:r>
-              <w:t>中</w:t>
-            </w:r>
-            <w:r>
-              <w:t xml:space="preserve"> (70-79)    ☐ </w:t>
-            </w:r>
-            <w:r>
-              <w:t>及格</w:t>
-            </w:r>
-            <w:r>
-              <w:t xml:space="preserve"> (60-69)    ☐ </w:t>
-            </w:r>
-            <w:r>
-              <w:t>不及格</w:t>
-            </w:r>
-            <w:r>
-              <w:t xml:space="preserve"> (&lt;60)</w:t>
+              <w:t>优 (90+)    ☐ 良 (80-89)    ☐ 中 (70-79)    ☐ 及格 (60-69)    ☐ 不及格 (&lt;60)</w:t>
             </w:r>
           </w:p>
         </w:tc>
@@ -5714,26 +5271,14 @@
         </w:pBdr>
         <w:spacing w:before="280" w:after="120"/>
       </w:pPr>
-      <w:proofErr w:type="gramStart"/>
       <w:r>
         <w:rPr>
           <w:b/>
           <w:color w:val="1A7A3D"/>
           <w:sz w:val="36"/>
         </w:rPr>
-        <w:t xml:space="preserve">6  </w:t>
+        <w:t>6  签字与归档</w:t>
       </w:r>
-      <w:proofErr w:type="spellStart"/>
-      <w:r>
-        <w:rPr>
-          <w:b/>
-          <w:color w:val="1A7A3D"/>
-          <w:sz w:val="36"/>
-        </w:rPr>
-        <w:t>签字与归档</w:t>
-      </w:r>
-      <w:proofErr w:type="spellEnd"/>
-      <w:proofErr w:type="gramEnd"/>
     </w:p>
     <w:tbl>
       <w:tblPr>
@@ -5851,13 +5396,7 @@
               <w:spacing w:before="40" w:after="40"/>
             </w:pPr>
             <w:r>
-              <w:t xml:space="preserve">___________________  </w:t>
-            </w:r>
-            <w:r>
-              <w:t>日期：</w:t>
-            </w:r>
-            <w:r>
-              <w:t>2026-06-13</w:t>
+              <w:t>___________________  日期：2026-06-13</w:t>
             </w:r>
           </w:p>
         </w:tc>
@@ -5909,13 +5448,7 @@
               <w:spacing w:before="40" w:after="40"/>
             </w:pPr>
             <w:r>
-              <w:t xml:space="preserve">___________________  </w:t>
-            </w:r>
-            <w:r>
-              <w:t>日期：</w:t>
-            </w:r>
-            <w:r>
-              <w:t>2026-06-13</w:t>
+              <w:t>___________________  日期：2026-06-13</w:t>
             </w:r>
           </w:p>
         </w:tc>
@@ -5946,21 +5479,7 @@
                 <w:color w:val="2B2B2B"/>
                 <w:sz w:val="19"/>
               </w:rPr>
-              <w:t xml:space="preserve">Git </w:t>
-            </w:r>
-            <w:r>
-              <w:rPr>
-                <w:color w:val="2B2B2B"/>
-                <w:sz w:val="19"/>
-              </w:rPr>
-              <w:t>仓库</w:t>
-            </w:r>
-            <w:r>
-              <w:rPr>
-                <w:color w:val="2B2B2B"/>
-                <w:sz w:val="19"/>
-              </w:rPr>
-              <w:t xml:space="preserve"> Tag</w:t>
+              <w:t>Git 仓库 Tag</w:t>
             </w:r>
           </w:p>
         </w:tc>
@@ -6039,31 +5558,7 @@
               <w:rPr>
                 <w:lang w:eastAsia="zh-CN"/>
               </w:rPr>
-              <w:t>课程设计归档目录</w:t>
-            </w:r>
-            <w:r>
-              <w:rPr>
-                <w:lang w:eastAsia="zh-CN"/>
-              </w:rPr>
-              <w:t xml:space="preserve"> / Git </w:t>
-            </w:r>
-            <w:r>
-              <w:rPr>
-                <w:lang w:eastAsia="zh-CN"/>
-              </w:rPr>
-              <w:t>仓库</w:t>
-            </w:r>
-            <w:r>
-              <w:rPr>
-                <w:lang w:eastAsia="zh-CN"/>
-              </w:rPr>
-              <w:t xml:space="preserve"> Releases / </w:t>
-            </w:r>
-            <w:r>
-              <w:rPr>
-                <w:lang w:eastAsia="zh-CN"/>
-              </w:rPr>
-              <w:t>指导教师指定提交位置（待补充）</w:t>
+              <w:t>课程设计归档目录 / Git 仓库 Releases / 指导教师指定提交位置（待补充）</w:t>
             </w:r>
           </w:p>
         </w:tc>
@@ -6666,11 +6161,6 @@
     <w:lsdException w:name="Book Title" w:uiPriority="33" w:qFormat="1"/>
     <w:lsdException w:name="Bibliography" w:semiHidden="1" w:uiPriority="37" w:unhideWhenUsed="1"/>
     <w:lsdException w:name="TOC Heading" w:semiHidden="1" w:uiPriority="39" w:unhideWhenUsed="1" w:qFormat="1"/>
-    <w:lsdException w:name="Plain Table 5" w:semiHidden="1" w:unhideWhenUsed="1"/>
-    <w:lsdException w:name="Grid Table Light" w:semiHidden="1" w:unhideWhenUsed="1"/>
-    <w:lsdException w:name="Grid Table 1 Light" w:semiHidden="1" w:unhideWhenUsed="1"/>
-    <w:lsdException w:name="Grid Table 2" w:semiHidden="1" w:unhideWhenUsed="1"/>
-    <w:lsdException w:name="Grid Table 3" w:semiHidden="1" w:unhideWhenUsed="1"/>
     <w:lsdException w:name="Grid Table 4" w:uiPriority="49"/>
     <w:lsdException w:name="Grid Table 5 Dark" w:uiPriority="50"/>
     <w:lsdException w:name="Grid Table 6 Colorful" w:uiPriority="51"/>

</xml_diff>